<commit_message>
contextualize for Hyundai: plant anchors, ROI calc, architecture diagrams
- index.html + build_pptx.py: HMGICS/AIRS/Boston Dynamics callout on slide 2;
  Ulsan/Metaplant cadence on slide 3; Recommended Hyundai Start cards on UC-01
  (HMGMA IONIQ paint) and UC-06 (Ulsan stamping + Asan welding); summary slide
  anchors pilots at specific plants
- New: ROI_Calculator_Hyundai.xlsx with 4 sheets (Inputs, Pilot Sizing,
  Full Use Cases, Notes), Ulsan-scale defaults, 3-year NPV math
- New: 2 reference architecture SVGs (Visual Inspection + Predictive Maintenance)
  + PNGs, embedded as appendix slides 16 and 17 in the PPTX
- executive_brief: Hyundai AI-bets complement paragraph; pilot recommendations
  anchored at HMGMA and Ulsan/Asan
- README: full bundle map, distribution flow, ROI calculator usage guide
</commit_message>
<xml_diff>
--- a/executive_brief.docx
+++ b/executive_brief.docx
@@ -383,6 +383,29 @@
           <w:color w:val="1E293B"/>
           <w:sz w:val="21"/>
         </w:rPr>
+        <w:t xml:space="preserve">A complement, not a replacement, for Hyundai's AI bets. </w:t>
+      </w:r>
+      <w:r>
+        <w:rPr>
+          <w:rFonts w:ascii="Calibri" w:hAnsi="Calibri"/>
+          <w:b w:val="0"/>
+          <w:color w:val="1E293B"/>
+          <w:sz w:val="21"/>
+        </w:rPr>
+        <w:t>Hyundai Motor Group already operates HMGICS Singapore as a smart-factory testbed and has invested in AI through AIRS Company and Boston Dynamics. PeopleTech's role is to bring those innovations to production scale at high-volume plants — Ulsan, Asan, HMGMA Metaplant America, HMMA, HMMC, HMI — and operationalize AI on lines already running today.</w:t>
+      </w:r>
+    </w:p>
+    <w:p>
+      <w:pPr>
+        <w:spacing w:after="80" w:line="288" w:lineRule="auto"/>
+      </w:pPr>
+      <w:r>
+        <w:rPr>
+          <w:rFonts w:ascii="Calibri" w:hAnsi="Calibri"/>
+          <w:b/>
+          <w:color w:val="1E293B"/>
+          <w:sz w:val="21"/>
+        </w:rPr>
         <w:t xml:space="preserve">Manufacturing domain depth. </w:t>
       </w:r>
       <w:r>
@@ -581,7 +604,7 @@
           <w:color w:val="1E293B"/>
           <w:sz w:val="21"/>
         </w:rPr>
-        <w:t xml:space="preserve">Pilot 1 — AI-based Visual Inspection. </w:t>
+        <w:t xml:space="preserve">Pilot 1 — AI-based Visual Inspection at HMGMA Metaplant America. </w:t>
       </w:r>
       <w:r>
         <w:rPr>
@@ -590,7 +613,7 @@
           <w:color w:val="1E293B"/>
           <w:sz w:val="21"/>
         </w:rPr>
-        <w:t>Edge-deployed CNN models on paint or final inspection. Success criteria: ≥30% reduction in escape defects vs baseline, &lt;2s detection latency, MES line-hold integration validated.</w:t>
+        <w:t>Edge-deployed CNN models on the IONIQ 5 / IONIQ 9 paint line. Success criteria: ≥30% reduction in escape defects vs baseline, &lt;2s detection latency, MES line-hold integration validated. Fast-follow on Tucson / Santa Fe paint at HMMA.</w:t>
       </w:r>
     </w:p>
     <w:p>
@@ -604,7 +627,7 @@
           <w:color w:val="1E293B"/>
           <w:sz w:val="21"/>
         </w:rPr>
-        <w:t xml:space="preserve">Pilot 2 — Predictive Maintenance. </w:t>
+        <w:t xml:space="preserve">Pilot 2 — Predictive Maintenance on Ulsan stamping + Asan welding. </w:t>
       </w:r>
       <w:r>
         <w:rPr>
@@ -613,7 +636,7 @@
           <w:color w:val="1E293B"/>
           <w:sz w:val="21"/>
         </w:rPr>
-        <w:t>Vibration + acoustic sensor mesh on 3–5 high-criticality assets. Success criteria: ≥25% reduction in unplanned downtime, work-order auto-generation in SAP PM, at least one predicted failure validated with measured lead time.</w:t>
+        <w:t>Vibration + acoustic sensor mesh on 3–5 high-criticality assets at the world's largest auto plant. Success criteria: ≥25% reduction in unplanned downtime, work-order auto-generation in SAP PM, at least one predicted failure validated with measured lead time.</w:t>
       </w:r>
     </w:p>
     <w:p>

</xml_diff>